<commit_message>
changed DMR calcs, gave more DMR optionality, and cleaning up code
</commit_message>
<xml_diff>
--- a/gcr-models/gcr_model_documentation.docx
+++ b/gcr-models/gcr_model_documentation.docx
@@ -1691,7 +1691,7 @@
               <w:rPr>
                 <w:sz w:val="18"/>
               </w:rPr>
-              <w:t>$7.2M</w:t>
+              <w:t>$21.6M</w:t>
             </w:r>
           </w:p>
         </w:tc>
@@ -2112,7 +2112,7 @@
                 <w:color w:val="1E3C78"/>
                 <w:sz w:val="18"/>
               </w:rPr>
-              <w:t>rel_rr at $7.2M budget</w:t>
+              <w:t>rel_rr at $21.6M budget</w:t>
             </w:r>
           </w:p>
         </w:tc>
@@ -2172,7 +2172,7 @@
               <w:rPr>
                 <w:sz w:val="18"/>
               </w:rPr>
-              <w:t>0.0029%</w:t>
+              <w:t>0.0086%</w:t>
             </w:r>
           </w:p>
         </w:tc>
@@ -2230,7 +2230,7 @@
               <w:rPr>
                 <w:sz w:val="18"/>
               </w:rPr>
-              <w:t>0.0144%</w:t>
+              <w:t>0.0432%</w:t>
             </w:r>
           </w:p>
         </w:tc>
@@ -2288,7 +2288,7 @@
               <w:rPr>
                 <w:sz w:val="18"/>
               </w:rPr>
-              <w:t>0.1440%</w:t>
+              <w:t>0.4320%</w:t>
             </w:r>
           </w:p>
         </w:tc>
@@ -2321,7 +2321,7 @@
           <w:color w:val="503C00"/>
           <w:sz w:val="18"/>
         </w:rPr>
-        <w:t>Note: rel_rr_from_int = rel_rr * cause_fraction (0.00624) ~ 0.0000% to 0.0009% of total r_max.</w:t>
+        <w:t>Note: rel_rr_from_int = rel_rr * cause_fraction (0.00624) ~ 0.0001% to 0.0027% of total r_max.</w:t>
       </w:r>
     </w:p>
     <w:p>
@@ -2641,7 +2641,7 @@
               <w:rPr>
                 <w:sz w:val="18"/>
               </w:rPr>
-              <w:t>$5.7M</w:t>
+              <w:t>$17.1M</w:t>
             </w:r>
           </w:p>
         </w:tc>
@@ -3062,7 +3062,7 @@
                 <w:color w:val="1E3C78"/>
                 <w:sz w:val="18"/>
               </w:rPr>
-              <w:t>rel_rr at $5.7M budget</w:t>
+              <w:t>rel_rr at $17.1M budget</w:t>
             </w:r>
           </w:p>
         </w:tc>
@@ -3122,7 +3122,7 @@
               <w:rPr>
                 <w:sz w:val="18"/>
               </w:rPr>
-              <w:t>0.0023%</w:t>
+              <w:t>0.0068%</w:t>
             </w:r>
           </w:p>
         </w:tc>
@@ -3180,7 +3180,7 @@
               <w:rPr>
                 <w:sz w:val="18"/>
               </w:rPr>
-              <w:t>0.0114%</w:t>
+              <w:t>0.0342%</w:t>
             </w:r>
           </w:p>
         </w:tc>
@@ -3238,7 +3238,7 @@
               <w:rPr>
                 <w:sz w:val="18"/>
               </w:rPr>
-              <w:t>0.1140%</w:t>
+              <w:t>0.3420%</w:t>
             </w:r>
           </w:p>
         </w:tc>
@@ -3271,7 +3271,7 @@
           <w:color w:val="503C00"/>
           <w:sz w:val="18"/>
         </w:rPr>
-        <w:t>Note: rel_rr_from_int = rel_rr * cause_fraction (0.03513) ~ 0.0001% to 0.0040% of total r_max.</w:t>
+        <w:t>Note: rel_rr_from_int = rel_rr * cause_fraction (0.03513) ~ 0.0002% to 0.0120% of total r_max.</w:t>
       </w:r>
     </w:p>
     <w:p>
@@ -3286,7 +3286,7 @@
           <w:color w:val="503C00"/>
           <w:sz w:val="18"/>
         </w:rPr>
-        <w:t>Note: The 10x discount reflects that Q4.4 responses (0.2% per $10M) were judged optimistic. nuclear cause_fraction = 0.03513, so rel_rr_from_int ranges from 0.00008% to 0.00401% of total r_max.</w:t>
+        <w:t>Note: The 10x discount reflects that Q4.4 responses (0.2% per $10M) were judged optimistic. nuclear cause_fraction = 0.03513, so rel_rr_from_int ranges from 0.00024% to 0.01202% of total r_max.</w:t>
       </w:r>
     </w:p>
     <w:p>
@@ -3391,7 +3391,7 @@
               <w:rPr>
                 <w:sz w:val="18"/>
               </w:rPr>
-              <w:t>$70M</w:t>
+              <w:t>$210M</w:t>
             </w:r>
           </w:p>
         </w:tc>
@@ -3812,7 +3812,7 @@
                 <w:color w:val="1E3C78"/>
                 <w:sz w:val="18"/>
               </w:rPr>
-              <w:t>rel_rr at $70M budget</w:t>
+              <w:t>rel_rr at $210M budget</w:t>
             </w:r>
           </w:p>
         </w:tc>
@@ -3872,7 +3872,7 @@
               <w:rPr>
                 <w:sz w:val="18"/>
               </w:rPr>
-              <w:t>0.0280%</w:t>
+              <w:t>0.0840%</w:t>
             </w:r>
           </w:p>
         </w:tc>
@@ -3930,7 +3930,7 @@
               <w:rPr>
                 <w:sz w:val="18"/>
               </w:rPr>
-              <w:t>0.1400%</w:t>
+              <w:t>0.4200%</w:t>
             </w:r>
           </w:p>
         </w:tc>
@@ -3988,7 +3988,7 @@
               <w:rPr>
                 <w:sz w:val="18"/>
               </w:rPr>
-              <w:t>1.4000%</w:t>
+              <w:t>4.2000%</w:t>
             </w:r>
           </w:p>
         </w:tc>
@@ -4021,7 +4021,7 @@
           <w:color w:val="503C00"/>
           <w:sz w:val="18"/>
         </w:rPr>
-        <w:t>Note: rel_rr_from_int = rel_rr * cause_fraction (0.91891) ~ 0.0257% to 1.2865% of total r_max.</w:t>
+        <w:t>Note: rel_rr_from_int = rel_rr * cause_fraction (0.91891) ~ 0.0772% to 3.8594% of total r_max.</w:t>
       </w:r>
     </w:p>
     <w:p>
@@ -4036,7 +4036,7 @@
           <w:color w:val="503C00"/>
           <w:sz w:val="18"/>
         </w:rPr>
-        <w:t>Note: AI cause_fraction = 0.919, so rel_rr_from_int = 0.026% to 1.286% of total r_max. At 10% cumulative x-risk (r_max ~ 0.00187) this corresponds to roughly 0–0 bp absolute risk reduction per $1B (peak-annual basis).</w:t>
+        <w:t>Note: AI cause_fraction = 0.919, so rel_rr_from_int = 0.077% to 3.859% of total r_max. At 10% cumulative x-risk (r_max ~ 0.00187) this corresponds to roughly 0–1 bp absolute risk reduction per $1B (peak-annual basis).</w:t>
       </w:r>
     </w:p>
     <w:p>

</xml_diff>